<commit_message>
Fix IDF formatting: real headings, inventor tables, instructions box, footer
</commit_message>
<xml_diff>
--- a/A Method for Cause-Discriminated Consensus Reliability and Adaptive Case Routing in Multi-Specialist Medical AI.docx
+++ b/A Method for Cause-Discriminated Consensus Reliability and Adaptive Case Routing in Multi-Specialist Medical AI.docx
@@ -9,7 +9,8 @@
       <w:r>
         <w:rPr>
           <w:b/>
-          <w:sz w:val="32"/>
+          <w:color w:val="1F3864"/>
+          <w:sz w:val="36"/>
         </w:rPr>
         <w:t>INVENTION DISCLOSURE FORM (IDF)</w:t>
       </w:r>
@@ -26,246 +27,624 @@
         <w:t>Strictly Confidential</w:t>
       </w:r>
     </w:p>
-    <w:p/>
     <w:p>
+      <w:pPr>
+        <w:jc w:val="center"/>
+      </w:pPr>
       <w:r>
         <w:rPr>
           <w:b/>
-          <w:sz w:val="26"/>
+          <w:sz w:val="20"/>
+        </w:rPr>
+        <w:t xml:space="preserve">Email: </w:t>
+      </w:r>
+      <w:r>
+        <w:rPr>
+          <w:color w:val="0563C1"/>
+          <w:sz w:val="20"/>
+          <w:u w:val="single"/>
+        </w:rPr>
+        <w:t>patents@cumail.in</w:t>
+      </w:r>
+    </w:p>
+    <w:p/>
+    <w:tbl>
+      <w:tblPr>
+        <w:tblStyle w:val="TableGrid"/>
+        <w:tblW w:type="auto" w:w="0"/>
+        <w:tblLook w:firstColumn="1" w:firstRow="1" w:lastColumn="0" w:lastRow="0" w:noHBand="0" w:noVBand="1" w:val="04A0"/>
+      </w:tblPr>
+      <w:tblGrid>
+        <w:gridCol w:w="8640"/>
+      </w:tblGrid>
+      <w:tr>
+        <w:tc>
+          <w:tcPr>
+            <w:tcW w:type="dxa" w:w="8640"/>
+            <w:shd w:val="clear" w:color="auto" w:fill="F2F2F2"/>
+          </w:tcPr>
+          <w:p>
+            <w:r/>
+            <w:r>
+              <w:rPr>
+                <w:b/>
+                <w:sz w:val="20"/>
+              </w:rPr>
+              <w:t>INSTRUCTIONS:</w:t>
+            </w:r>
+          </w:p>
+          <w:p>
+            <w:r>
+              <w:rPr>
+                <w:sz w:val="20"/>
+              </w:rPr>
+              <w:t>1. Go to File → Download → Microsoft Word (.docx)</w:t>
+            </w:r>
+          </w:p>
+          <w:p>
+            <w:r>
+              <w:rPr>
+                <w:sz w:val="20"/>
+              </w:rPr>
+              <w:t>2. Download the IDF in your local storage</w:t>
+            </w:r>
+          </w:p>
+          <w:p>
+            <w:r>
+              <w:rPr>
+                <w:sz w:val="20"/>
+              </w:rPr>
+              <w:t>3. Explain your invention comprehensively in the form.</w:t>
+            </w:r>
+          </w:p>
+          <w:p>
+            <w:r>
+              <w:rPr>
+                <w:sz w:val="20"/>
+              </w:rPr>
+              <w:t>4. Save your IDF file with the name of the Title of your invention. eg: "A Smart Electric Kettle"</w:t>
+            </w:r>
+          </w:p>
+          <w:p>
+            <w:r>
+              <w:rPr>
+                <w:sz w:val="20"/>
+              </w:rPr>
+              <w:t>5. Upload the duly filled IDF below.</w:t>
+            </w:r>
+          </w:p>
+        </w:tc>
+      </w:tr>
+    </w:tbl>
+    <w:p/>
+    <w:p>
+      <w:pPr>
+        <w:pStyle w:val="Heading2"/>
+      </w:pPr>
+      <w:r>
+        <w:rPr>
+          <w:b/>
+          <w:color w:val="1F3864"/>
+          <w:sz w:val="24"/>
         </w:rPr>
         <w:t>INVENTOR DETAIL:</w:t>
       </w:r>
     </w:p>
+    <w:tbl>
+      <w:tblPr>
+        <w:tblStyle w:val="TableGrid"/>
+        <w:tblW w:type="auto" w:w="0"/>
+        <w:jc w:val="center"/>
+        <w:tblLook w:firstColumn="1" w:firstRow="1" w:lastColumn="0" w:lastRow="0" w:noHBand="0" w:noVBand="1" w:val="04A0"/>
+      </w:tblPr>
+      <w:tblGrid>
+        <w:gridCol w:w="4320"/>
+        <w:gridCol w:w="4320"/>
+      </w:tblGrid>
+      <w:tr>
+        <w:tc>
+          <w:tcPr>
+            <w:tcW w:type="dxa" w:w="2880"/>
+            <w:shd w:val="clear" w:color="auto" w:fill="EDEDED"/>
+          </w:tcPr>
+          <w:p>
+            <w:r/>
+            <w:r>
+              <w:rPr>
+                <w:b/>
+                <w:sz w:val="20"/>
+              </w:rPr>
+              <w:t>NAME:</w:t>
+            </w:r>
+          </w:p>
+        </w:tc>
+        <w:tc>
+          <w:tcPr>
+            <w:tcW w:type="dxa" w:w="6480"/>
+          </w:tcPr>
+          <w:p>
+            <w:r/>
+            <w:r>
+              <w:rPr>
+                <w:b w:val="0"/>
+                <w:sz w:val="20"/>
+              </w:rPr>
+              <w:t>[To be completed by inventor]</w:t>
+            </w:r>
+          </w:p>
+        </w:tc>
+      </w:tr>
+      <w:tr>
+        <w:tc>
+          <w:tcPr>
+            <w:tcW w:type="dxa" w:w="2880"/>
+            <w:shd w:val="clear" w:color="auto" w:fill="EDEDED"/>
+          </w:tcPr>
+          <w:p>
+            <w:r/>
+            <w:r>
+              <w:rPr>
+                <w:b/>
+                <w:sz w:val="20"/>
+              </w:rPr>
+              <w:t>GENDER:</w:t>
+            </w:r>
+          </w:p>
+        </w:tc>
+        <w:tc>
+          <w:tcPr>
+            <w:tcW w:type="dxa" w:w="6480"/>
+          </w:tcPr>
+          <w:p>
+            <w:r/>
+            <w:r>
+              <w:rPr>
+                <w:b w:val="0"/>
+                <w:sz w:val="20"/>
+              </w:rPr>
+              <w:t>[To be completed]</w:t>
+            </w:r>
+          </w:p>
+        </w:tc>
+      </w:tr>
+      <w:tr>
+        <w:tc>
+          <w:tcPr>
+            <w:tcW w:type="dxa" w:w="2880"/>
+            <w:shd w:val="clear" w:color="auto" w:fill="EDEDED"/>
+          </w:tcPr>
+          <w:p>
+            <w:r/>
+            <w:r>
+              <w:rPr>
+                <w:b/>
+                <w:sz w:val="20"/>
+              </w:rPr>
+              <w:t>EMAIL:</w:t>
+            </w:r>
+          </w:p>
+        </w:tc>
+        <w:tc>
+          <w:tcPr>
+            <w:tcW w:type="dxa" w:w="6480"/>
+          </w:tcPr>
+          <w:p>
+            <w:r/>
+            <w:r>
+              <w:rPr>
+                <w:b w:val="0"/>
+                <w:sz w:val="20"/>
+              </w:rPr>
+              <w:t>[To be completed]</w:t>
+            </w:r>
+          </w:p>
+        </w:tc>
+      </w:tr>
+      <w:tr>
+        <w:tc>
+          <w:tcPr>
+            <w:tcW w:type="dxa" w:w="2880"/>
+            <w:shd w:val="clear" w:color="auto" w:fill="EDEDED"/>
+          </w:tcPr>
+          <w:p>
+            <w:r/>
+            <w:r>
+              <w:rPr>
+                <w:b/>
+                <w:sz w:val="20"/>
+              </w:rPr>
+              <w:t>MOBILE NO:</w:t>
+            </w:r>
+          </w:p>
+        </w:tc>
+        <w:tc>
+          <w:tcPr>
+            <w:tcW w:type="dxa" w:w="6480"/>
+          </w:tcPr>
+          <w:p>
+            <w:r/>
+            <w:r>
+              <w:rPr>
+                <w:b w:val="0"/>
+                <w:sz w:val="20"/>
+              </w:rPr>
+              <w:t>[To be completed]</w:t>
+            </w:r>
+          </w:p>
+        </w:tc>
+      </w:tr>
+      <w:tr>
+        <w:tc>
+          <w:tcPr>
+            <w:tcW w:type="dxa" w:w="2880"/>
+            <w:shd w:val="clear" w:color="auto" w:fill="EDEDED"/>
+          </w:tcPr>
+          <w:p>
+            <w:r/>
+            <w:r>
+              <w:rPr>
+                <w:b/>
+                <w:sz w:val="20"/>
+              </w:rPr>
+              <w:t>DEPARTMENT:</w:t>
+            </w:r>
+          </w:p>
+        </w:tc>
+        <w:tc>
+          <w:tcPr>
+            <w:tcW w:type="dxa" w:w="6480"/>
+          </w:tcPr>
+          <w:p>
+            <w:r/>
+            <w:r>
+              <w:rPr>
+                <w:b w:val="0"/>
+                <w:sz w:val="20"/>
+              </w:rPr>
+              <w:t>[To be completed — e.g., Computer Science / AI Research]</w:t>
+            </w:r>
+          </w:p>
+        </w:tc>
+      </w:tr>
+      <w:tr>
+        <w:tc>
+          <w:tcPr>
+            <w:tcW w:type="dxa" w:w="2880"/>
+            <w:shd w:val="clear" w:color="auto" w:fill="EDEDED"/>
+          </w:tcPr>
+          <w:p>
+            <w:r/>
+            <w:r>
+              <w:rPr>
+                <w:b/>
+                <w:sz w:val="20"/>
+              </w:rPr>
+              <w:t>DESIGNATION:</w:t>
+            </w:r>
+          </w:p>
+        </w:tc>
+        <w:tc>
+          <w:tcPr>
+            <w:tcW w:type="dxa" w:w="6480"/>
+          </w:tcPr>
+          <w:p>
+            <w:r/>
+            <w:r>
+              <w:rPr>
+                <w:b w:val="0"/>
+                <w:sz w:val="20"/>
+              </w:rPr>
+              <w:t>[To be completed]</w:t>
+            </w:r>
+          </w:p>
+        </w:tc>
+      </w:tr>
+      <w:tr>
+        <w:tc>
+          <w:tcPr>
+            <w:tcW w:type="dxa" w:w="2880"/>
+            <w:shd w:val="clear" w:color="auto" w:fill="EDEDED"/>
+          </w:tcPr>
+          <w:p>
+            <w:r/>
+            <w:r>
+              <w:rPr>
+                <w:b/>
+                <w:sz w:val="20"/>
+              </w:rPr>
+              <w:t>SCANNED HAND SIGNATURE:</w:t>
+            </w:r>
+          </w:p>
+        </w:tc>
+        <w:tc>
+          <w:tcPr>
+            <w:tcW w:type="dxa" w:w="6480"/>
+          </w:tcPr>
+          <w:p>
+            <w:r/>
+            <w:r>
+              <w:rPr>
+                <w:b w:val="0"/>
+                <w:sz w:val="20"/>
+              </w:rPr>
+              <w:t>[To be attached]</w:t>
+            </w:r>
+          </w:p>
+        </w:tc>
+      </w:tr>
+    </w:tbl>
+    <w:p/>
     <w:p>
+      <w:pPr>
+        <w:pStyle w:val="Heading2"/>
+      </w:pPr>
       <w:r>
         <w:rPr>
           <w:b/>
-          <w:sz w:val="22"/>
-        </w:rPr>
-        <w:t xml:space="preserve">NAME: </w:t>
-      </w:r>
-      <w:r>
-        <w:rPr>
-          <w:sz w:val="22"/>
-        </w:rPr>
-        <w:t>[Inventor Full Name — to be completed by inventor]</w:t>
-      </w:r>
-    </w:p>
-    <w:p>
-      <w:r>
-        <w:rPr>
-          <w:b/>
-          <w:sz w:val="22"/>
-        </w:rPr>
-        <w:t xml:space="preserve">GENDER: </w:t>
-      </w:r>
-      <w:r>
-        <w:rPr>
-          <w:sz w:val="22"/>
-        </w:rPr>
-        <w:t>[To be completed]</w:t>
-      </w:r>
-    </w:p>
-    <w:p>
-      <w:r>
-        <w:rPr>
-          <w:b/>
-          <w:sz w:val="22"/>
-        </w:rPr>
-        <w:t xml:space="preserve">EMAIL: </w:t>
-      </w:r>
-      <w:r>
-        <w:rPr>
-          <w:sz w:val="22"/>
-        </w:rPr>
-        <w:t>[To be completed]</w:t>
-      </w:r>
-    </w:p>
-    <w:p>
-      <w:r>
-        <w:rPr>
-          <w:b/>
-          <w:sz w:val="22"/>
-        </w:rPr>
-        <w:t xml:space="preserve">MOBILE NO: </w:t>
-      </w:r>
-      <w:r>
-        <w:rPr>
-          <w:sz w:val="22"/>
-        </w:rPr>
-        <w:t>[To be completed]</w:t>
-      </w:r>
-    </w:p>
-    <w:p>
-      <w:r>
-        <w:rPr>
-          <w:b/>
-          <w:sz w:val="22"/>
-        </w:rPr>
-        <w:t xml:space="preserve">DEPARTMENT: </w:t>
-      </w:r>
-      <w:r>
-        <w:rPr>
-          <w:sz w:val="22"/>
-        </w:rPr>
-        <w:t>[To be completed — e.g., Computer Science / AI Research]</w:t>
-      </w:r>
-    </w:p>
-    <w:p>
-      <w:r>
-        <w:rPr>
-          <w:b/>
-          <w:sz w:val="22"/>
-        </w:rPr>
-        <w:t xml:space="preserve">DESIGNATION: </w:t>
-      </w:r>
-      <w:r>
-        <w:rPr>
-          <w:sz w:val="22"/>
-        </w:rPr>
-        <w:t>[To be completed]</w:t>
-      </w:r>
-    </w:p>
-    <w:p>
-      <w:r>
-        <w:rPr>
-          <w:b/>
-          <w:sz w:val="22"/>
-        </w:rPr>
-        <w:t xml:space="preserve">SCANNED HAND SIGNATURE: </w:t>
-      </w:r>
-      <w:r>
-        <w:rPr>
-          <w:sz w:val="22"/>
-        </w:rPr>
-        <w:t>[To be attached]</w:t>
-      </w:r>
-    </w:p>
-    <w:p/>
-    <w:p>
-      <w:r>
-        <w:rPr>
-          <w:b/>
-          <w:sz w:val="26"/>
+          <w:color w:val="1F3864"/>
+          <w:sz w:val="24"/>
         </w:rPr>
         <w:t>OTHER INVENTOR DETAIL:</w:t>
       </w:r>
     </w:p>
-    <w:p>
-      <w:r>
-        <w:rPr>
-          <w:b/>
-          <w:sz w:val="22"/>
-        </w:rPr>
-        <w:t xml:space="preserve">NAME: </w:t>
-      </w:r>
-      <w:r>
-        <w:rPr>
-          <w:sz w:val="22"/>
-        </w:rPr>
-        <w:t>[Co-inventor Name, if any — to be completed]</w:t>
-      </w:r>
-    </w:p>
-    <w:p>
-      <w:r>
-        <w:rPr>
-          <w:b/>
-          <w:sz w:val="22"/>
-        </w:rPr>
-        <w:t xml:space="preserve">GENDER: </w:t>
-      </w:r>
-      <w:r>
-        <w:rPr>
-          <w:sz w:val="22"/>
-        </w:rPr>
-        <w:t>[To be completed]</w:t>
-      </w:r>
-    </w:p>
-    <w:p>
-      <w:r>
-        <w:rPr>
-          <w:b/>
-          <w:sz w:val="22"/>
-        </w:rPr>
-        <w:t xml:space="preserve">EMAIL: </w:t>
-      </w:r>
-      <w:r>
-        <w:rPr>
-          <w:sz w:val="22"/>
-        </w:rPr>
-        <w:t>[To be completed]</w:t>
-      </w:r>
-    </w:p>
-    <w:p>
-      <w:r>
-        <w:rPr>
-          <w:b/>
-          <w:sz w:val="22"/>
-        </w:rPr>
-        <w:t xml:space="preserve">MOBILE NO: </w:t>
-      </w:r>
-      <w:r>
-        <w:rPr>
-          <w:sz w:val="22"/>
-        </w:rPr>
-        <w:t>[To be completed]</w:t>
-      </w:r>
-    </w:p>
-    <w:p>
-      <w:r>
-        <w:rPr>
-          <w:b/>
-          <w:sz w:val="22"/>
-        </w:rPr>
-        <w:t xml:space="preserve">DEPARTMENT: </w:t>
-      </w:r>
-      <w:r>
-        <w:rPr>
-          <w:sz w:val="22"/>
-        </w:rPr>
-        <w:t>[To be completed]</w:t>
-      </w:r>
-    </w:p>
-    <w:p>
-      <w:r>
-        <w:rPr>
-          <w:b/>
-          <w:sz w:val="22"/>
-        </w:rPr>
-        <w:t xml:space="preserve">DESIGNATION: </w:t>
-      </w:r>
-      <w:r>
-        <w:rPr>
-          <w:sz w:val="22"/>
-        </w:rPr>
-        <w:t>[To be completed]</w:t>
-      </w:r>
-    </w:p>
-    <w:p>
-      <w:r>
-        <w:rPr>
-          <w:b/>
-          <w:sz w:val="22"/>
-        </w:rPr>
-        <w:t xml:space="preserve">SCANNED HAND SIGNATURE: </w:t>
-      </w:r>
-      <w:r>
-        <w:rPr>
-          <w:sz w:val="22"/>
-        </w:rPr>
-        <w:t>[To be attached]</w:t>
-      </w:r>
-    </w:p>
+    <w:tbl>
+      <w:tblPr>
+        <w:tblStyle w:val="TableGrid"/>
+        <w:tblW w:type="auto" w:w="0"/>
+        <w:jc w:val="center"/>
+        <w:tblLook w:firstColumn="1" w:firstRow="1" w:lastColumn="0" w:lastRow="0" w:noHBand="0" w:noVBand="1" w:val="04A0"/>
+      </w:tblPr>
+      <w:tblGrid>
+        <w:gridCol w:w="4320"/>
+        <w:gridCol w:w="4320"/>
+      </w:tblGrid>
+      <w:tr>
+        <w:tc>
+          <w:tcPr>
+            <w:tcW w:type="dxa" w:w="2880"/>
+            <w:shd w:val="clear" w:color="auto" w:fill="EDEDED"/>
+          </w:tcPr>
+          <w:p>
+            <w:r/>
+            <w:r>
+              <w:rPr>
+                <w:b/>
+                <w:sz w:val="20"/>
+              </w:rPr>
+              <w:t>NAME:</w:t>
+            </w:r>
+          </w:p>
+        </w:tc>
+        <w:tc>
+          <w:tcPr>
+            <w:tcW w:type="dxa" w:w="6480"/>
+          </w:tcPr>
+          <w:p>
+            <w:r/>
+            <w:r>
+              <w:rPr>
+                <w:b w:val="0"/>
+                <w:sz w:val="20"/>
+              </w:rPr>
+              <w:t>[To be completed by inventor]</w:t>
+            </w:r>
+          </w:p>
+        </w:tc>
+      </w:tr>
+      <w:tr>
+        <w:tc>
+          <w:tcPr>
+            <w:tcW w:type="dxa" w:w="2880"/>
+            <w:shd w:val="clear" w:color="auto" w:fill="EDEDED"/>
+          </w:tcPr>
+          <w:p>
+            <w:r/>
+            <w:r>
+              <w:rPr>
+                <w:b/>
+                <w:sz w:val="20"/>
+              </w:rPr>
+              <w:t>GENDER:</w:t>
+            </w:r>
+          </w:p>
+        </w:tc>
+        <w:tc>
+          <w:tcPr>
+            <w:tcW w:type="dxa" w:w="6480"/>
+          </w:tcPr>
+          <w:p>
+            <w:r/>
+            <w:r>
+              <w:rPr>
+                <w:b w:val="0"/>
+                <w:sz w:val="20"/>
+              </w:rPr>
+              <w:t>[To be completed]</w:t>
+            </w:r>
+          </w:p>
+        </w:tc>
+      </w:tr>
+      <w:tr>
+        <w:tc>
+          <w:tcPr>
+            <w:tcW w:type="dxa" w:w="2880"/>
+            <w:shd w:val="clear" w:color="auto" w:fill="EDEDED"/>
+          </w:tcPr>
+          <w:p>
+            <w:r/>
+            <w:r>
+              <w:rPr>
+                <w:b/>
+                <w:sz w:val="20"/>
+              </w:rPr>
+              <w:t>EMAIL:</w:t>
+            </w:r>
+          </w:p>
+        </w:tc>
+        <w:tc>
+          <w:tcPr>
+            <w:tcW w:type="dxa" w:w="6480"/>
+          </w:tcPr>
+          <w:p>
+            <w:r/>
+            <w:r>
+              <w:rPr>
+                <w:b w:val="0"/>
+                <w:sz w:val="20"/>
+              </w:rPr>
+              <w:t>[To be completed]</w:t>
+            </w:r>
+          </w:p>
+        </w:tc>
+      </w:tr>
+      <w:tr>
+        <w:tc>
+          <w:tcPr>
+            <w:tcW w:type="dxa" w:w="2880"/>
+            <w:shd w:val="clear" w:color="auto" w:fill="EDEDED"/>
+          </w:tcPr>
+          <w:p>
+            <w:r/>
+            <w:r>
+              <w:rPr>
+                <w:b/>
+                <w:sz w:val="20"/>
+              </w:rPr>
+              <w:t>MOBILE NO:</w:t>
+            </w:r>
+          </w:p>
+        </w:tc>
+        <w:tc>
+          <w:tcPr>
+            <w:tcW w:type="dxa" w:w="6480"/>
+          </w:tcPr>
+          <w:p>
+            <w:r/>
+            <w:r>
+              <w:rPr>
+                <w:b w:val="0"/>
+                <w:sz w:val="20"/>
+              </w:rPr>
+              <w:t>[To be completed]</w:t>
+            </w:r>
+          </w:p>
+        </w:tc>
+      </w:tr>
+      <w:tr>
+        <w:tc>
+          <w:tcPr>
+            <w:tcW w:type="dxa" w:w="2880"/>
+            <w:shd w:val="clear" w:color="auto" w:fill="EDEDED"/>
+          </w:tcPr>
+          <w:p>
+            <w:r/>
+            <w:r>
+              <w:rPr>
+                <w:b/>
+                <w:sz w:val="20"/>
+              </w:rPr>
+              <w:t>DEPARTMENT:</w:t>
+            </w:r>
+          </w:p>
+        </w:tc>
+        <w:tc>
+          <w:tcPr>
+            <w:tcW w:type="dxa" w:w="6480"/>
+          </w:tcPr>
+          <w:p>
+            <w:r/>
+            <w:r>
+              <w:rPr>
+                <w:b w:val="0"/>
+                <w:sz w:val="20"/>
+              </w:rPr>
+              <w:t>[To be completed — e.g., Computer Science / AI Research]</w:t>
+            </w:r>
+          </w:p>
+        </w:tc>
+      </w:tr>
+      <w:tr>
+        <w:tc>
+          <w:tcPr>
+            <w:tcW w:type="dxa" w:w="2880"/>
+            <w:shd w:val="clear" w:color="auto" w:fill="EDEDED"/>
+          </w:tcPr>
+          <w:p>
+            <w:r/>
+            <w:r>
+              <w:rPr>
+                <w:b/>
+                <w:sz w:val="20"/>
+              </w:rPr>
+              <w:t>DESIGNATION:</w:t>
+            </w:r>
+          </w:p>
+        </w:tc>
+        <w:tc>
+          <w:tcPr>
+            <w:tcW w:type="dxa" w:w="6480"/>
+          </w:tcPr>
+          <w:p>
+            <w:r/>
+            <w:r>
+              <w:rPr>
+                <w:b w:val="0"/>
+                <w:sz w:val="20"/>
+              </w:rPr>
+              <w:t>[To be completed]</w:t>
+            </w:r>
+          </w:p>
+        </w:tc>
+      </w:tr>
+      <w:tr>
+        <w:tc>
+          <w:tcPr>
+            <w:tcW w:type="dxa" w:w="2880"/>
+            <w:shd w:val="clear" w:color="auto" w:fill="EDEDED"/>
+          </w:tcPr>
+          <w:p>
+            <w:r/>
+            <w:r>
+              <w:rPr>
+                <w:b/>
+                <w:sz w:val="20"/>
+              </w:rPr>
+              <w:t>SCANNED HAND SIGNATURE:</w:t>
+            </w:r>
+          </w:p>
+        </w:tc>
+        <w:tc>
+          <w:tcPr>
+            <w:tcW w:type="dxa" w:w="6480"/>
+          </w:tcPr>
+          <w:p>
+            <w:r/>
+            <w:r>
+              <w:rPr>
+                <w:b w:val="0"/>
+                <w:sz w:val="20"/>
+              </w:rPr>
+              <w:t>[To be attached]</w:t>
+            </w:r>
+          </w:p>
+        </w:tc>
+      </w:tr>
+    </w:tbl>
+    <w:p/>
     <w:p>
       <w:r>
         <w:br w:type="page"/>
       </w:r>
     </w:p>
     <w:p>
+      <w:pPr>
+        <w:pStyle w:val="Heading2"/>
+      </w:pPr>
       <w:r>
         <w:rPr>
           <w:b/>
-          <w:sz w:val="26"/>
+          <w:color w:val="1F3864"/>
+          <w:sz w:val="24"/>
         </w:rPr>
         <w:t>A) Please enlist the Key concepts and terms/Keywords/Synonyms used in the Invention?</w:t>
       </w:r>
@@ -292,6 +671,7 @@
             <w:r>
               <w:rPr>
                 <w:b/>
+                <w:color w:val="000000"/>
                 <w:sz w:val="20"/>
               </w:rPr>
               <w:t>S. No</w:t>
@@ -337,6 +717,9 @@
             <w:tcW w:type="dxa" w:w="2880"/>
           </w:tcPr>
           <w:p>
+            <w:pPr>
+              <w:jc w:val="center"/>
+            </w:pPr>
             <w:r/>
             <w:r>
               <w:rPr>
@@ -384,6 +767,9 @@
             <w:tcW w:type="dxa" w:w="2880"/>
           </w:tcPr>
           <w:p>
+            <w:pPr>
+              <w:jc w:val="center"/>
+            </w:pPr>
             <w:r/>
             <w:r>
               <w:rPr>
@@ -431,6 +817,9 @@
             <w:tcW w:type="dxa" w:w="2880"/>
           </w:tcPr>
           <w:p>
+            <w:pPr>
+              <w:jc w:val="center"/>
+            </w:pPr>
             <w:r/>
             <w:r>
               <w:rPr>
@@ -478,6 +867,9 @@
             <w:tcW w:type="dxa" w:w="2880"/>
           </w:tcPr>
           <w:p>
+            <w:pPr>
+              <w:jc w:val="center"/>
+            </w:pPr>
             <w:r/>
             <w:r>
               <w:rPr>
@@ -525,6 +917,9 @@
             <w:tcW w:type="dxa" w:w="2880"/>
           </w:tcPr>
           <w:p>
+            <w:pPr>
+              <w:jc w:val="center"/>
+            </w:pPr>
             <w:r/>
             <w:r>
               <w:rPr>
@@ -572,6 +967,9 @@
             <w:tcW w:type="dxa" w:w="2880"/>
           </w:tcPr>
           <w:p>
+            <w:pPr>
+              <w:jc w:val="center"/>
+            </w:pPr>
             <w:r/>
             <w:r>
               <w:rPr>
@@ -619,6 +1017,9 @@
             <w:tcW w:type="dxa" w:w="2880"/>
           </w:tcPr>
           <w:p>
+            <w:pPr>
+              <w:jc w:val="center"/>
+            </w:pPr>
             <w:r/>
             <w:r>
               <w:rPr>
@@ -666,6 +1067,9 @@
             <w:tcW w:type="dxa" w:w="2880"/>
           </w:tcPr>
           <w:p>
+            <w:pPr>
+              <w:jc w:val="center"/>
+            </w:pPr>
             <w:r/>
             <w:r>
               <w:rPr>
@@ -713,6 +1117,9 @@
             <w:tcW w:type="dxa" w:w="2880"/>
           </w:tcPr>
           <w:p>
+            <w:pPr>
+              <w:jc w:val="center"/>
+            </w:pPr>
             <w:r/>
             <w:r>
               <w:rPr>
@@ -761,83 +1168,118 @@
       </w:r>
     </w:p>
     <w:p>
+      <w:pPr>
+        <w:pStyle w:val="Heading1"/>
+      </w:pPr>
       <w:r>
         <w:rPr>
           <w:b/>
-          <w:sz w:val="26"/>
+          <w:color w:val="1F3864"/>
+          <w:sz w:val="28"/>
         </w:rPr>
         <w:t>1. TITLE OF INVENTION (15 words max)</w:t>
       </w:r>
     </w:p>
     <w:p>
+      <w:pPr>
+        <w:spacing w:after="160"/>
+      </w:pPr>
       <w:r>
         <w:rPr>
           <w:b/>
+          <w:i w:val="0"/>
           <w:sz w:val="22"/>
         </w:rPr>
         <w:t>A Method and System for Cause-Discriminated Consensus Reliability Assessment and Adaptive Case Routing in Multi-Specialist Medical AI.</w:t>
       </w:r>
     </w:p>
-    <w:p/>
     <w:p>
+      <w:pPr>
+        <w:pStyle w:val="Heading1"/>
+      </w:pPr>
       <w:r>
         <w:rPr>
           <w:b/>
-          <w:sz w:val="26"/>
+          <w:color w:val="1F3864"/>
+          <w:sz w:val="28"/>
         </w:rPr>
         <w:t>2. PROBLEM STATEMENT &amp; BACKGROUND</w:t>
       </w:r>
     </w:p>
     <w:p>
+      <w:pPr>
+        <w:pStyle w:val="Heading2"/>
+      </w:pPr>
       <w:r>
         <w:rPr>
           <w:b/>
-          <w:sz w:val="22"/>
+          <w:color w:val="1F3864"/>
+          <w:sz w:val="24"/>
         </w:rPr>
         <w:t>Problem Statement:</w:t>
       </w:r>
     </w:p>
     <w:p>
+      <w:pPr>
+        <w:spacing w:after="160"/>
+      </w:pPr>
       <w:r>
         <w:rPr>
           <w:b w:val="0"/>
+          <w:i w:val="0"/>
           <w:sz w:val="22"/>
         </w:rPr>
         <w:t>Hospitals and health-tech platforms are increasingly deploying teams of AI "specialist" programs (for example, a neurosurgeon-agent, an oncologist-agent, and a radiologist-agent) that jointly review a patient's case and produce a single combined opinion for the treating clinician. Today, when these programs agree with one another, the system treats that agreement as proof that the answer is correct, and it simply blends the individual opinions into one confidence-weighted final answer.</w:t>
       </w:r>
     </w:p>
     <w:p>
+      <w:pPr>
+        <w:spacing w:after="160"/>
+      </w:pPr>
       <w:r>
         <w:rPr>
           <w:b w:val="0"/>
+          <w:i w:val="0"/>
           <w:sz w:val="22"/>
         </w:rPr>
         <w:t>This is a problem because agreement between AI programs does not always mean the answer is right. Three situations are routinely mistaken for genuine, trustworthy agreement: (i) the AI programs may be agreeing with each other simply because each one is designed to be agreeable and defers to what the others already said, rather than because the medical evidence actually supports that conclusion; (ii) the AI programs may all have been built from similar underlying technology and may therefore share the same blind spot, so they all make the identical mistake together and "confirm" each other's error; and (iii) one AI specialist may have quietly identified the correct, less obvious answer, but its dissenting view gets outvoted and discarded during blending, even though it was the one that was right. In all three situations the clinician receives what looks like a confident, unanimous recommendation, when in fact that confidence is unearned.</w:t>
       </w:r>
     </w:p>
     <w:p>
+      <w:pPr>
+        <w:spacing w:after="160"/>
+      </w:pPr>
       <w:r>
         <w:rPr>
           <w:b w:val="0"/>
+          <w:i w:val="0"/>
           <w:sz w:val="22"/>
         </w:rPr>
         <w:t>This matters because the people affected are patients and the treating clinicians and hospitals who are legally and medically responsible for the final decision. A wrong but confident-looking AI recommendation in surgery, oncology, or radiology can lead to a missed diagnosis, an unnecessary procedure, or a delayed treatment. When something goes wrong, hospitals and regulators also need to know exactly which AI specialist said what, and why the team reached the conclusion it did, so that responsibility can be fairly assigned; today's blended, single-answer outputs do not preserve that information.</w:t>
       </w:r>
     </w:p>
     <w:p>
+      <w:pPr>
+        <w:spacing w:after="160"/>
+      </w:pPr>
       <w:r>
         <w:rPr>
           <w:b w:val="0"/>
+          <w:i w:val="0"/>
           <w:sz w:val="22"/>
         </w:rPr>
         <w:t>Current multi-agent medical AI products are not sufficient because they are built to produce one tidy answer as quickly as possible. They have no built-in way of telling the difference between "the specialists agree because the evidence genuinely supports it" and "the specialists agree because they are echoing each other or sharing the same flaw." They also do not have a standard, automatic way of deciding what to do next when a disagreement is detected — whether to trust the majority, show the dissenting opinion to the doctor, or simply order another scan or test to settle the question — and they do not keep a detailed, tamper-resistant record of each individual specialist's reasoning that a hospital could later use to establish liability.</w:t>
       </w:r>
     </w:p>
     <w:p>
+      <w:pPr>
+        <w:pStyle w:val="Heading2"/>
+      </w:pPr>
       <w:r>
         <w:rPr>
           <w:b/>
-          <w:sz w:val="22"/>
+          <w:color w:val="1F3864"/>
+          <w:sz w:val="24"/>
         </w:rPr>
         <w:t>Existing Solutions / Prior Methods (if known):</w:t>
       </w:r>
@@ -898,20 +1340,27 @@
       </w:r>
     </w:p>
     <w:p>
+      <w:pPr>
+        <w:spacing w:after="160"/>
+      </w:pPr>
       <w:r>
         <w:rPr>
           <w:b w:val="0"/>
+          <w:i w:val="0"/>
           <w:sz w:val="22"/>
         </w:rPr>
         <w:t>None of the above solutions combine, in one system: a live measurement that tells agreement-because-evidence apart from agreement-because-bias-or-shared-error apart from suppressed-minority-truth; an automatic decision about what to do about it (commit / surface dissent / go get more evidence); and a per-agent audit record detailed enough to support clinical liability attribution. This is the gap the present invention addresses.</w:t>
       </w:r>
     </w:p>
-    <w:p/>
     <w:p>
+      <w:pPr>
+        <w:pStyle w:val="Heading1"/>
+      </w:pPr>
       <w:r>
         <w:rPr>
           <w:b/>
-          <w:sz w:val="26"/>
+          <w:color w:val="1F3864"/>
+          <w:sz w:val="28"/>
         </w:rPr>
         <w:t>3. OBJECTIVE OF THE INVENTION</w:t>
       </w:r>
@@ -977,45 +1426,65 @@
       </w:r>
     </w:p>
     <w:p>
+      <w:pPr>
+        <w:pStyle w:val="Heading1"/>
+      </w:pPr>
       <w:r>
         <w:rPr>
           <w:b/>
-          <w:sz w:val="26"/>
+          <w:color w:val="1F3864"/>
+          <w:sz w:val="28"/>
         </w:rPr>
         <w:t>4. INVENTION DETAILS</w:t>
       </w:r>
     </w:p>
     <w:p>
+      <w:pPr>
+        <w:pStyle w:val="Heading2"/>
+      </w:pPr>
       <w:r>
         <w:rPr>
           <w:b/>
-          <w:sz w:val="22"/>
+          <w:color w:val="1F3864"/>
+          <w:sz w:val="24"/>
         </w:rPr>
         <w:t>Summary of the Invention:</w:t>
       </w:r>
     </w:p>
     <w:p>
+      <w:pPr>
+        <w:spacing w:after="160"/>
+      </w:pPr>
       <w:r>
         <w:rPr>
           <w:b w:val="0"/>
+          <w:i w:val="0"/>
           <w:sz w:val="22"/>
         </w:rPr>
         <w:t>The invention is a method and supporting system for a team of specialist AI programs (for example, an AI neurosurgeon, an AI oncologist, and an AI radiologist) that review the same patient case together. Instead of simply averaging or vote-counting the specialists' opinions into one final answer whenever they agree, the invention first runs a set of built-in checks that ask, in effect: "Do these specialists agree because the medical evidence genuinely points to the same conclusion, or is something else going on?" The checks can tell apart three specific "something else" situations: the specialists are simply being agreeable with each other (agreement bias); the specialists share an underlying flaw and are all making the same mistake together (shared-model error); or one specialist's differing, minority opinion is being outvoted even though its reasoning is well supported (minority suppression). Based on which situation is detected, and how confident that detection is, the system automatically chooses one of three actions: it finalizes a single result when agreement is judged genuine; it prepares and shows the clinician a clearly organized report of the dissenting opinion, ranked by the strength of its supporting evidence, when a minority view deserves attention; or it automatically requests a specific new piece of evidence — such as a particular scan, blood test, or medical-guideline lookup — that is chosen specifically to resolve the exact point where the specialists disagree or where their shared flaw is suspected. Throughout this process, the system keeps a detailed record of exactly what each specialist AI said, why it said it, what evidence it used, and how the final decision was reached, so that if something is later questioned, it is clear which part of the system was responsible for which part of the recommendation.</w:t>
       </w:r>
     </w:p>
     <w:p>
+      <w:pPr>
+        <w:pStyle w:val="Heading2"/>
+      </w:pPr>
       <w:r>
         <w:rPr>
           <w:b/>
-          <w:sz w:val="22"/>
+          <w:color w:val="1F3864"/>
+          <w:sz w:val="24"/>
         </w:rPr>
         <w:t>Technical Description – How it Works (step-by-step):</w:t>
       </w:r>
     </w:p>
     <w:p>
+      <w:pPr>
+        <w:spacing w:after="160"/>
+      </w:pPr>
       <w:r>
         <w:rPr>
           <w:b/>
+          <w:i w:val="0"/>
           <w:sz w:val="22"/>
         </w:rPr>
         <w:t>Input / starting material:</w:t>
@@ -1033,9 +1502,13 @@
       </w:r>
     </w:p>
     <w:p>
+      <w:pPr>
+        <w:spacing w:after="160"/>
+      </w:pPr>
       <w:r>
         <w:rPr>
           <w:b/>
+          <w:i w:val="0"/>
           <w:sz w:val="22"/>
         </w:rPr>
         <w:t>Key components / steps involved:</w:t>
@@ -1141,9 +1614,13 @@
       </w:r>
     </w:p>
     <w:p>
+      <w:pPr>
+        <w:spacing w:after="160"/>
+      </w:pPr>
       <w:r>
         <w:rPr>
           <w:b/>
+          <w:i w:val="0"/>
           <w:sz w:val="22"/>
         </w:rPr>
         <w:t>Output / final result:</w:t>
@@ -1161,9 +1638,13 @@
       </w:r>
     </w:p>
     <w:p>
+      <w:pPr>
+        <w:spacing w:after="160"/>
+      </w:pPr>
       <w:r>
         <w:rPr>
           <w:b w:val="0"/>
+          <w:i/>
           <w:sz w:val="22"/>
         </w:rPr>
         <w:t>Diagrams / flowcharts: A process flow diagram showing (1) independent first-pass generation by the neurosurgeon-, oncologist-, and radiologist-agents, (2) the answer-level and reasoning-level agreement checks, (3) the triadic counterfactual probe (no-peer / sham-peer / evidence-peer arms), (4) the shared-model-error and minority-suppression checks feeding into (5) the consensus-reliability signal, (6) the three-way adaptive router (Commit / Surface Dissent / Acquire Evidence), and (7) the hash-chained per-agent audit ledger, is described in Section 6 (Drawings) and can be provided as a supporting flowchart attachment.</w:t>
@@ -1175,18 +1656,26 @@
       </w:r>
     </w:p>
     <w:p>
+      <w:pPr>
+        <w:pStyle w:val="Heading1"/>
+      </w:pPr>
       <w:r>
         <w:rPr>
           <w:b/>
-          <w:sz w:val="26"/>
+          <w:color w:val="1F3864"/>
+          <w:sz w:val="28"/>
         </w:rPr>
         <w:t>5. NOVEL ASPECTS OF THE INVENTION</w:t>
       </w:r>
     </w:p>
     <w:p>
+      <w:pPr>
+        <w:spacing w:after="160"/>
+      </w:pPr>
       <w:r>
         <w:rPr>
           <w:b w:val="0"/>
+          <w:i w:val="0"/>
           <w:sz w:val="22"/>
         </w:rPr>
         <w:t>The invention is new compared to existing multi-agent medical AI and multi-agent debate systems in the following specific, concrete ways:</w:t>
@@ -1298,7 +1787,7 @@
                 <w:b/>
                 <w:sz w:val="20"/>
               </w:rPr>
-              <w:t>Yes/No</w:t>
+              <w:t>Yes / No — Justification</w:t>
             </w:r>
           </w:p>
         </w:tc>
@@ -1312,7 +1801,7 @@
             <w:r/>
             <w:r>
               <w:rPr>
-                <w:b w:val="0"/>
+                <w:b/>
                 <w:sz w:val="20"/>
               </w:rPr>
               <w:t>Cost effective</w:t>
@@ -1344,7 +1833,7 @@
             <w:r/>
             <w:r>
               <w:rPr>
-                <w:b w:val="0"/>
+                <w:b/>
                 <w:sz w:val="20"/>
               </w:rPr>
               <w:t>Improved efficiency</w:t>
@@ -1376,7 +1865,7 @@
             <w:r/>
             <w:r>
               <w:rPr>
-                <w:b w:val="0"/>
+                <w:b/>
                 <w:sz w:val="20"/>
               </w:rPr>
               <w:t>Eco-friendly</w:t>
@@ -1408,7 +1897,7 @@
             <w:r/>
             <w:r>
               <w:rPr>
-                <w:b w:val="0"/>
+                <w:b/>
                 <w:sz w:val="20"/>
               </w:rPr>
               <w:t>Higher accuracy</w:t>
@@ -1440,7 +1929,7 @@
             <w:r/>
             <w:r>
               <w:rPr>
-                <w:b w:val="0"/>
+                <w:b/>
                 <w:sz w:val="20"/>
               </w:rPr>
               <w:t>User-friendly</w:t>
@@ -1466,10 +1955,14 @@
     </w:tbl>
     <w:p/>
     <w:p>
+      <w:pPr>
+        <w:pStyle w:val="Heading2"/>
+      </w:pPr>
       <w:r>
         <w:rPr>
           <w:b/>
-          <w:sz w:val="22"/>
+          <w:color w:val="1F3864"/>
+          <w:sz w:val="24"/>
         </w:rPr>
         <w:t>Advantages:</w:t>
       </w:r>
@@ -1535,37 +2028,65 @@
       </w:r>
     </w:p>
     <w:p>
+      <w:pPr>
+        <w:pStyle w:val="Heading1"/>
+      </w:pPr>
       <w:r>
         <w:rPr>
           <w:b/>
-          <w:sz w:val="26"/>
+          <w:color w:val="1F3864"/>
+          <w:sz w:val="28"/>
         </w:rPr>
         <w:t>6. DRAWINGS OR SUPPORT MATERIAL</w:t>
       </w:r>
     </w:p>
     <w:p>
+      <w:pPr>
+        <w:spacing w:after="160"/>
+      </w:pPr>
       <w:r>
         <w:rPr>
           <w:b w:val="0"/>
+          <w:i w:val="0"/>
           <w:sz w:val="22"/>
         </w:rPr>
-        <w:t>A process-flow diagram is recommended as supporting material, depicting: (1) parallel independent first-pass reasoning by the neurosurgeon-, oncologist-, and radiologist-agents; (2) the answer-level and reasoning-level agreement comparison module; (3) the triadic counterfactual probe module with its three arms (no-peer / evidentially-null sham-peer / evidence-bearing peer); (4) the correlated/shared-model-error detection module referencing per-agent fault-domain tags; (5) the minority-suppression detection module; (6) the consensus-reliability signal aggregator; (7) the three-way adaptive router (Commit / Surface Dissent / Acquire Evidence) with the evidence-acquisition module linking to imaging/lab/retrieval systems; and (8) the hash-chained, per-agent, evidence-linked audit ledger. [Diagram to be attached separately by the inventor.]</w:t>
+        <w:t>A process-flow diagram is recommended as supporting material, depicting: (1) parallel independent first-pass reasoning by the neurosurgeon-, oncologist-, and radiologist-agents; (2) the answer-level and reasoning-level agreement comparison module; (3) the triadic counterfactual probe module with its three arms (no-peer / evidentially-null sham-peer / evidence-bearing peer); (4) the correlated/shared-model-error detection module referencing per-agent fault-domain tags; (5) the minority-suppression detection module; (6) the consensus-reliability signal aggregator; (7) the three-way adaptive router (Commit / Surface Dissent / Acquire Evidence) with the evidence-acquisition module linking to imaging/lab/retrieval systems; and (8) the hash-chained, per-agent, evidence-linked audit ledger.</w:t>
       </w:r>
     </w:p>
-    <w:p/>
     <w:p>
+      <w:pPr>
+        <w:spacing w:after="160"/>
+      </w:pPr>
+      <w:r>
+        <w:rPr>
+          <w:b w:val="0"/>
+          <w:i/>
+          <w:sz w:val="22"/>
+        </w:rPr>
+        <w:t>[Diagram/flowchart to be attached separately by the inventor.]</w:t>
+      </w:r>
+    </w:p>
+    <w:p>
+      <w:pPr>
+        <w:pStyle w:val="Heading1"/>
+      </w:pPr>
       <w:r>
         <w:rPr>
           <w:b/>
-          <w:sz w:val="26"/>
+          <w:color w:val="1F3864"/>
+          <w:sz w:val="28"/>
         </w:rPr>
         <w:t>7. ABSTRACT (150 words)</w:t>
       </w:r>
     </w:p>
     <w:p>
+      <w:pPr>
+        <w:spacing w:after="160"/>
+      </w:pPr>
       <w:r>
         <w:rPr>
           <w:b w:val="0"/>
+          <w:i w:val="0"/>
           <w:sz w:val="22"/>
         </w:rPr>
         <w:t>A method for a multi-specialist medical artificial-intelligence system, in which specialist agents (e.g., neurosurgeon-, oncologist-, radiologist-agents) independently analyse a case and then undergo a label-free triadic counterfactual probe — comparing each agent's response under no-peer, evidentially-null sham-peer, and evidence-bearing peer conditions — to compute a cause-discriminated consensus-reliability signal that separates genuine evidence-driven agreement from agreement bias, correlated shared-model error, and suppression of a correct minority opinion. Based on this signal, the system adaptively routes the case to one of three dispositions: committing a single confidence-weighted result; surfacing a preserved, evidence-ranked minority/dissent report to the clinician; or triggering targeted acquisition of specific new imaging, laboratory, or retrieval evidence chosen to resolve the identified point of contention, using each dissenting agent's self-declared falsifier as the acquisition target. A hash-chained, per-agent, evidence-linked audit record supporting clinical liability attribution is generated throughout.</w:t>
@@ -1581,10 +2102,11 @@
           <w:i/>
           <w:sz w:val="18"/>
         </w:rPr>
-        <w:t>Invention Disclosure Form (IDF) — © All rights reserved.</w:t>
+        <w:t>Strictly Confidential — Invention Disclosure Form (IDF) — © 2026. All rights reserved.</w:t>
       </w:r>
     </w:p>
     <w:sectPr>
+      <w:footerReference w:type="default" r:id="rId9"/>
       <w:pgSz w:w="12240" w:h="15840"/>
       <w:pgMar w:top="1440" w:right="1800" w:bottom="1440" w:left="1800" w:header="720" w:footer="720" w:gutter="0"/>
       <w:cols w:space="720"/>
@@ -1592,6 +2114,34 @@
     </w:sectPr>
   </w:body>
 </w:document>
+</file>
+
+<file path=word/footer1.xml><?xml version="1.0" encoding="utf-8"?>
+<w:ftr xmlns:m="http://schemas.openxmlformats.org/officeDocument/2006/math" xmlns:mc="http://schemas.openxmlformats.org/markup-compatibility/2006" xmlns:mo="http://schemas.microsoft.com/office/mac/office/2008/main" xmlns:mv="urn:schemas-microsoft-com:mac:vml" xmlns:o="urn:schemas-microsoft-com:office:office" xmlns:r="http://schemas.openxmlformats.org/officeDocument/2006/relationships" xmlns:v="urn:schemas-microsoft-com:vml" xmlns:w10="urn:schemas-microsoft-com:office:word" xmlns:w14="http://schemas.microsoft.com/office/word/2010/wordml" xmlns:w="http://schemas.openxmlformats.org/wordprocessingml/2006/main" xmlns:wne="http://schemas.microsoft.com/office/word/2006/wordml" xmlns:wp14="http://schemas.microsoft.com/office/word/2010/wordprocessingDrawing" xmlns:wp="http://schemas.openxmlformats.org/drawingml/2006/wordprocessingDrawing" xmlns:wpc="http://schemas.microsoft.com/office/word/2010/wordprocessingCanvas" xmlns:wpg="http://schemas.microsoft.com/office/word/2010/wordprocessingGroup" xmlns:wpi="http://schemas.microsoft.com/office/word/2010/wordprocessingInk" xmlns:wps="http://schemas.microsoft.com/office/word/2010/wordprocessingShape" mc:Ignorable="w14 wp14">
+  <w:p>
+    <w:pPr>
+      <w:pStyle w:val="Footer"/>
+      <w:jc w:val="center"/>
+    </w:pPr>
+    <w:r>
+      <w:rPr>
+        <w:i/>
+        <w:sz w:val="16"/>
+      </w:rPr>
+      <w:t xml:space="preserve">Strictly Confidential  |  Invention Disclosure Form (IDF)  |  Page </w:t>
+    </w:r>
+    <w:r>
+      <w:fldSimple w:instr="PAGE"/>
+    </w:r>
+    <w:r>
+      <w:rPr>
+        <w:i/>
+        <w:sz w:val="16"/>
+      </w:rPr>
+      <w:t xml:space="preserve">  |  © 2026. All rights reserved.</w:t>
+    </w:r>
+  </w:p>
+</w:ftr>
 </file>
 
 <file path=word/numbering.xml><?xml version="1.0" encoding="utf-8"?>
@@ -2021,10 +2571,10 @@
       <w:outlineLvl w:val="0"/>
     </w:pPr>
     <w:rPr>
-      <w:rFonts w:asciiTheme="majorHAnsi" w:eastAsiaTheme="majorEastAsia" w:hAnsiTheme="majorHAnsi" w:cstheme="majorBidi"/>
+      <w:rFonts w:asciiTheme="majorHAnsi" w:eastAsiaTheme="majorEastAsia" w:hAnsiTheme="majorHAnsi" w:cstheme="majorBidi" w:ascii="Calibri" w:hAnsi="Calibri"/>
       <w:b/>
       <w:bCs/>
-      <w:color w:val="365F91" w:themeColor="accent1" w:themeShade="BF"/>
+      <w:color w:val="1F3864"/>
       <w:sz w:val="28"/>
       <w:szCs w:val="28"/>
     </w:rPr>
@@ -2045,11 +2595,11 @@
       <w:outlineLvl w:val="1"/>
     </w:pPr>
     <w:rPr>
-      <w:rFonts w:asciiTheme="majorHAnsi" w:eastAsiaTheme="majorEastAsia" w:hAnsiTheme="majorHAnsi" w:cstheme="majorBidi"/>
+      <w:rFonts w:asciiTheme="majorHAnsi" w:eastAsiaTheme="majorEastAsia" w:hAnsiTheme="majorHAnsi" w:cstheme="majorBidi" w:ascii="Calibri" w:hAnsi="Calibri"/>
       <w:b/>
       <w:bCs/>
-      <w:color w:val="4F81BD" w:themeColor="accent1"/>
-      <w:sz w:val="26"/>
+      <w:color w:val="1F3864"/>
+      <w:sz w:val="24"/>
       <w:szCs w:val="26"/>
     </w:rPr>
   </w:style>

</xml_diff>